<commit_message>
Add cross-reference to the SA cross-mission integration in Discussion; rebuild illustrated manuscript
Co-Authored-By: Claude Opus 4.8 <noreply@anthropic.com>
</commit_message>
<xml_diff>
--- a/manuscript_with_figures.docx
+++ b/manuscript_with_figures.docx
@@ -1091,6 +1091,37 @@
         <w:pStyle w:val="Heading2"/>
       </w:pPr>
       <w:r>
+        <w:t>Relationship to a cross-mission salicylic-acid integration</w:t>
+      </w:r>
+    </w:p>
+    <w:p>
+      <w:r>
+        <w:t xml:space="preserve">These microbiome findings dovetail with a companion cross-mission analysis that integrated the same OSD-767 transcriptome with an Advanced Plant Habitat experiment manipulating salicylic-acid (SA) signalling (wild-type MoneyMaker versus the SA-deficient </w:t>
+      </w:r>
+      <w:r>
+        <w:rPr>
+          <w:i/>
+        </w:rPr>
+        <w:t>NahG</w:t>
+      </w:r>
+      <w:r>
+        <w:t xml:space="preserve"> line). That analysis concluded that the spaceflight transcriptome resembles an SA-deficient, biotic-defense-primed state. Our results offer a proximal explanation: spaceflight-induced dysbiosis — and the microbe-driven, flight-independent host module identified here — could be the stimulus that elicits that defense-primed signature, with SA acting as the gating regulator of plant biotic immunity. Reassuringly, both analyses independently recover the blue-light amplification of the spaceflight response (here, 4,716 versus 523 leaf DEGs; there, a blue-LED-amplified biotic/hormone stress axis) despite using different pipelines. This also rationalises why gene-level spaceflight signatures replicate poorly across missions while the biotic-defense </w:t>
+      </w:r>
+      <w:r>
+        <w:rPr>
+          <w:i/>
+        </w:rPr>
+        <w:t>pattern</w:t>
+      </w:r>
+      <w:r>
+        <w:t xml:space="preserve"> is conserved: if that pattern tracks the mission-variable microbiome rather than a fixed microgravity program, pattern-level conservation alongside gene-level divergence is exactly what one expects. A full comparison is provided in `COMPARISON_with_SA_integration.md`.</w:t>
+      </w:r>
+    </w:p>
+    <w:p>
+      <w:pPr>
+        <w:pStyle w:val="Heading2"/>
+      </w:pPr>
+      <w:r>
         <w:t>Limitations</w:t>
       </w:r>
     </w:p>

</xml_diff>

<commit_message>
Fix Fig 4 WGCNA module-trait heatmaps (were empty) — rebuild from TSVs in Python
The R-generated Fig 4 A/B rendered only title/axis/colorbar with no tiles or labels.
Regenerated both (Leaf 13 modules, Adv-Root 17 modules x 4 traits) with correlations
and significance stars; rebuilt illustrated manuscript.

Co-Authored-By: Claude Opus 4.8 <noreply@anthropic.com>
</commit_message>
<xml_diff>
--- a/manuscript_with_figures.docx
+++ b/manuscript_with_figures.docx
@@ -608,7 +608,7 @@
       <w:r>
         <w:drawing>
           <wp:inline xmlns:a="http://schemas.openxmlformats.org/drawingml/2006/main" xmlns:pic="http://schemas.openxmlformats.org/drawingml/2006/picture">
-            <wp:extent cx="5760720" cy="4800600"/>
+            <wp:extent cx="5760720" cy="6786509"/>
             <wp:docPr id="7" name="Picture 7"/>
             <wp:cNvGraphicFramePr>
               <a:graphicFrameLocks noChangeAspect="1"/>
@@ -629,7 +629,7 @@
                   <pic:spPr>
                     <a:xfrm>
                       <a:off x="0" y="0"/>
-                      <a:ext cx="5760720" cy="4800600"/>
+                      <a:ext cx="5760720" cy="6786509"/>
                     </a:xfrm>
                     <a:prstGeom prst="rect"/>
                   </pic:spPr>
@@ -658,7 +658,7 @@
       <w:r>
         <w:drawing>
           <wp:inline xmlns:a="http://schemas.openxmlformats.org/drawingml/2006/main" xmlns:pic="http://schemas.openxmlformats.org/drawingml/2006/picture">
-            <wp:extent cx="5760720" cy="6144768"/>
+            <wp:extent cx="5116831" cy="7498079"/>
             <wp:docPr id="8" name="Picture 8"/>
             <wp:cNvGraphicFramePr>
               <a:graphicFrameLocks noChangeAspect="1"/>
@@ -679,7 +679,7 @@
                   <pic:spPr>
                     <a:xfrm>
                       <a:off x="0" y="0"/>
-                      <a:ext cx="5760720" cy="6144768"/>
+                      <a:ext cx="5116831" cy="7498079"/>
                     </a:xfrm>
                     <a:prstGeom prst="rect"/>
                   </pic:spPr>

</xml_diff>

<commit_message>
Add GO-based biology labels to WGCNA modules (Fig 4 + Fig 6 axes + Table 1)
- Derive dominant GO biology per module from per-module enrichment -> results/module_annotations.tsv
- Relabel Fig 4 (Leaf/Adv-Root) module-trait heatmaps with "colour + GO biology"
- Rebuild Fig 6 as a labelled module-taxon bubble grid (significant, BH padj<0.05)
- Insert Table 1 (module GO annotations) into manuscript; docx builder now renders tables

Co-Authored-By: Claude Opus 4.8 <noreply@anthropic.com>
</commit_message>
<xml_diff>
--- a/manuscript_with_figures.docx
+++ b/manuscript_with_figures.docx
@@ -608,7 +608,7 @@
       <w:r>
         <w:drawing>
           <wp:inline xmlns:a="http://schemas.openxmlformats.org/drawingml/2006/main" xmlns:pic="http://schemas.openxmlformats.org/drawingml/2006/picture">
-            <wp:extent cx="5760720" cy="6786509"/>
+            <wp:extent cx="5760720" cy="6887567"/>
             <wp:docPr id="7" name="Picture 7"/>
             <wp:cNvGraphicFramePr>
               <a:graphicFrameLocks noChangeAspect="1"/>
@@ -629,7 +629,7 @@
                   <pic:spPr>
                     <a:xfrm>
                       <a:off x="0" y="0"/>
-                      <a:ext cx="5760720" cy="6786509"/>
+                      <a:ext cx="5760720" cy="6887567"/>
                     </a:xfrm>
                     <a:prstGeom prst="rect"/>
                   </pic:spPr>
@@ -648,7 +648,7 @@
         <w:t>*Figure 4 (Leaf).</w:t>
       </w:r>
       <w:r>
-        <w:t xml:space="preserve"> WGCNA module–trait correlations (flight, light, 16S/ITS dysbiosis).*</w:t>
+        <w:t xml:space="preserve"> WGCNA module–trait correlations (flight, light, 16S/ITS dysbiosis). Each module is labelled with its dominant GO biology (Table 1); cells show Spearman rho with significance stars.*</w:t>
       </w:r>
     </w:p>
     <w:p>
@@ -658,7 +658,7 @@
       <w:r>
         <w:drawing>
           <wp:inline xmlns:a="http://schemas.openxmlformats.org/drawingml/2006/main" xmlns:pic="http://schemas.openxmlformats.org/drawingml/2006/picture">
-            <wp:extent cx="5116831" cy="7498079"/>
+            <wp:extent cx="5010317" cy="7498079"/>
             <wp:docPr id="8" name="Picture 8"/>
             <wp:cNvGraphicFramePr>
               <a:graphicFrameLocks noChangeAspect="1"/>
@@ -679,7 +679,7 @@
                   <pic:spPr>
                     <a:xfrm>
                       <a:off x="0" y="0"/>
-                      <a:ext cx="5116831" cy="7498079"/>
+                      <a:ext cx="5010317" cy="7498079"/>
                     </a:xfrm>
                     <a:prstGeom prst="rect"/>
                   </pic:spPr>
@@ -698,9 +698,1497 @@
         <w:t>*Figure 4 (Adv-Root).</w:t>
       </w:r>
       <w:r>
-        <w:t xml:space="preserve"> Module–trait correlations; the black module tracks ITS dysbiosis (r=−0.85) but not flight.*</w:t>
+        <w:t xml:space="preserve"> Module–trait correlations with GO-biology labels (Table 1). The black (nucleus) module tracks ITS dysbiosis (r=−0.85) but not flight; the turquoise (oxidative-stress/peroxidase) module is the largest flight-correlated module.*</w:t>
       </w:r>
     </w:p>
+    <w:p>
+      <w:pPr>
+        <w:pStyle w:val="Heading2"/>
+      </w:pPr>
+      <w:r>
+        <w:t>Module functional annotation (GO)</w:t>
+      </w:r>
+    </w:p>
+    <w:p>
+      <w:r>
+        <w:t>To make the WGCNA module colours interpretable, each module was annotated with its dominant biology from per-module Gene Ontology enrichment (Table 1). These human-readable labels are shown alongside the module colours on the axes of Figs 4 and 6. Modules with no significant enrichment are marked accordingly.</w:t>
+      </w:r>
+    </w:p>
+    <w:p>
+      <w:r>
+        <w:rPr>
+          <w:b/>
+        </w:rPr>
+        <w:t>Table 1. GO-based functional annotation of WGCNA modules.</w:t>
+      </w:r>
+    </w:p>
+    <w:tbl>
+      <w:tblPr>
+        <w:tblStyle w:val="TableGrid"/>
+        <w:tblW w:type="auto" w:w="0"/>
+        <w:tblLook w:firstColumn="1" w:firstRow="1" w:lastColumn="0" w:lastRow="0" w:noHBand="0" w:noVBand="1" w:val="04A0"/>
+      </w:tblPr>
+      <w:tblGrid>
+        <w:gridCol w:w="2340"/>
+        <w:gridCol w:w="2340"/>
+        <w:gridCol w:w="2340"/>
+        <w:gridCol w:w="2340"/>
+      </w:tblGrid>
+      <w:tr>
+        <w:tc>
+          <w:tcPr>
+            <w:tcW w:type="dxa" w:w="2340"/>
+          </w:tcPr>
+          <w:p>
+            <w:r/>
+            <w:r>
+              <w:rPr>
+                <w:b/>
+                <w:sz w:val="16"/>
+              </w:rPr>
+              <w:t>Tissue</w:t>
+            </w:r>
+          </w:p>
+        </w:tc>
+        <w:tc>
+          <w:tcPr>
+            <w:tcW w:type="dxa" w:w="2340"/>
+          </w:tcPr>
+          <w:p>
+            <w:r/>
+            <w:r>
+              <w:rPr>
+                <w:b/>
+                <w:sz w:val="16"/>
+              </w:rPr>
+              <w:t>Module</w:t>
+            </w:r>
+          </w:p>
+        </w:tc>
+        <w:tc>
+          <w:tcPr>
+            <w:tcW w:type="dxa" w:w="2340"/>
+          </w:tcPr>
+          <w:p>
+            <w:r/>
+            <w:r>
+              <w:rPr>
+                <w:b/>
+                <w:sz w:val="16"/>
+              </w:rPr>
+              <w:t>GO biology (dominant)</w:t>
+            </w:r>
+          </w:p>
+        </w:tc>
+        <w:tc>
+          <w:tcPr>
+            <w:tcW w:type="dxa" w:w="2340"/>
+          </w:tcPr>
+          <w:p>
+            <w:r/>
+            <w:r>
+              <w:rPr>
+                <w:b/>
+                <w:sz w:val="16"/>
+              </w:rPr>
+              <w:t>Representative GO terms</w:t>
+            </w:r>
+          </w:p>
+        </w:tc>
+      </w:tr>
+      <w:tr>
+        <w:tc>
+          <w:tcPr>
+            <w:tcW w:type="dxa" w:w="2340"/>
+          </w:tcPr>
+          <w:p>
+            <w:r/>
+            <w:r>
+              <w:rPr>
+                <w:sz w:val="16"/>
+              </w:rPr>
+              <w:t>Adv-Root</w:t>
+            </w:r>
+          </w:p>
+        </w:tc>
+        <w:tc>
+          <w:tcPr>
+            <w:tcW w:type="dxa" w:w="2340"/>
+          </w:tcPr>
+          <w:p>
+            <w:r/>
+            <w:r>
+              <w:rPr>
+                <w:sz w:val="16"/>
+              </w:rPr>
+              <w:t>black</w:t>
+            </w:r>
+          </w:p>
+        </w:tc>
+        <w:tc>
+          <w:tcPr>
+            <w:tcW w:type="dxa" w:w="2340"/>
+          </w:tcPr>
+          <w:p>
+            <w:r/>
+            <w:r>
+              <w:rPr>
+                <w:sz w:val="16"/>
+              </w:rPr>
+              <w:t>Nucleus</w:t>
+            </w:r>
+          </w:p>
+        </w:tc>
+        <w:tc>
+          <w:tcPr>
+            <w:tcW w:type="dxa" w:w="2340"/>
+          </w:tcPr>
+          <w:p>
+            <w:r/>
+            <w:r>
+              <w:rPr>
+                <w:sz w:val="16"/>
+              </w:rPr>
+              <w:t>nucleus</w:t>
+            </w:r>
+          </w:p>
+        </w:tc>
+      </w:tr>
+      <w:tr>
+        <w:tc>
+          <w:tcPr>
+            <w:tcW w:type="dxa" w:w="2340"/>
+          </w:tcPr>
+          <w:p>
+            <w:r/>
+            <w:r>
+              <w:rPr>
+                <w:sz w:val="16"/>
+              </w:rPr>
+              <w:t>Adv-Root</w:t>
+            </w:r>
+          </w:p>
+        </w:tc>
+        <w:tc>
+          <w:tcPr>
+            <w:tcW w:type="dxa" w:w="2340"/>
+          </w:tcPr>
+          <w:p>
+            <w:r/>
+            <w:r>
+              <w:rPr>
+                <w:sz w:val="16"/>
+              </w:rPr>
+              <w:t>blue</w:t>
+            </w:r>
+          </w:p>
+        </w:tc>
+        <w:tc>
+          <w:tcPr>
+            <w:tcW w:type="dxa" w:w="2340"/>
+          </w:tcPr>
+          <w:p>
+            <w:r/>
+            <w:r>
+              <w:rPr>
+                <w:sz w:val="16"/>
+              </w:rPr>
+              <w:t>RNA processing</w:t>
+            </w:r>
+          </w:p>
+        </w:tc>
+        <w:tc>
+          <w:tcPr>
+            <w:tcW w:type="dxa" w:w="2340"/>
+          </w:tcPr>
+          <w:p>
+            <w:r/>
+            <w:r>
+              <w:rPr>
+                <w:sz w:val="16"/>
+              </w:rPr>
+              <w:t>protein binding; RNA binding; RNA modification</w:t>
+            </w:r>
+          </w:p>
+        </w:tc>
+      </w:tr>
+      <w:tr>
+        <w:tc>
+          <w:tcPr>
+            <w:tcW w:type="dxa" w:w="2340"/>
+          </w:tcPr>
+          <w:p>
+            <w:r/>
+            <w:r>
+              <w:rPr>
+                <w:sz w:val="16"/>
+              </w:rPr>
+              <w:t>Adv-Root</w:t>
+            </w:r>
+          </w:p>
+        </w:tc>
+        <w:tc>
+          <w:tcPr>
+            <w:tcW w:type="dxa" w:w="2340"/>
+          </w:tcPr>
+          <w:p>
+            <w:r/>
+            <w:r>
+              <w:rPr>
+                <w:sz w:val="16"/>
+              </w:rPr>
+              <w:t>brown</w:t>
+            </w:r>
+          </w:p>
+        </w:tc>
+        <w:tc>
+          <w:tcPr>
+            <w:tcW w:type="dxa" w:w="2340"/>
+          </w:tcPr>
+          <w:p>
+            <w:r/>
+            <w:r>
+              <w:rPr>
+                <w:sz w:val="16"/>
+              </w:rPr>
+              <w:t>Lipid / GTPase signalling</w:t>
+            </w:r>
+          </w:p>
+        </w:tc>
+        <w:tc>
+          <w:tcPr>
+            <w:tcW w:type="dxa" w:w="2340"/>
+          </w:tcPr>
+          <w:p>
+            <w:r/>
+            <w:r>
+              <w:rPr>
+                <w:sz w:val="16"/>
+              </w:rPr>
+              <w:t>ATP-dependent diacylglycerol kinase activity; phospholipase C-activati...</w:t>
+            </w:r>
+          </w:p>
+        </w:tc>
+      </w:tr>
+      <w:tr>
+        <w:tc>
+          <w:tcPr>
+            <w:tcW w:type="dxa" w:w="2340"/>
+          </w:tcPr>
+          <w:p>
+            <w:r/>
+            <w:r>
+              <w:rPr>
+                <w:sz w:val="16"/>
+              </w:rPr>
+              <w:t>Adv-Root</w:t>
+            </w:r>
+          </w:p>
+        </w:tc>
+        <w:tc>
+          <w:tcPr>
+            <w:tcW w:type="dxa" w:w="2340"/>
+          </w:tcPr>
+          <w:p>
+            <w:r/>
+            <w:r>
+              <w:rPr>
+                <w:sz w:val="16"/>
+              </w:rPr>
+              <w:t>cyan</w:t>
+            </w:r>
+          </w:p>
+        </w:tc>
+        <w:tc>
+          <w:tcPr>
+            <w:tcW w:type="dxa" w:w="2340"/>
+          </w:tcPr>
+          <w:p>
+            <w:r/>
+            <w:r>
+              <w:rPr>
+                <w:sz w:val="16"/>
+              </w:rPr>
+              <w:t>Photosynthesis (light harvesting)</w:t>
+            </w:r>
+          </w:p>
+        </w:tc>
+        <w:tc>
+          <w:tcPr>
+            <w:tcW w:type="dxa" w:w="2340"/>
+          </w:tcPr>
+          <w:p>
+            <w:r/>
+            <w:r>
+              <w:rPr>
+                <w:sz w:val="16"/>
+              </w:rPr>
+              <w:t>photosynthesis, light harvesting; photosynthesis; photosystem I</w:t>
+            </w:r>
+          </w:p>
+        </w:tc>
+      </w:tr>
+      <w:tr>
+        <w:tc>
+          <w:tcPr>
+            <w:tcW w:type="dxa" w:w="2340"/>
+          </w:tcPr>
+          <w:p>
+            <w:r/>
+            <w:r>
+              <w:rPr>
+                <w:sz w:val="16"/>
+              </w:rPr>
+              <w:t>Adv-Root</w:t>
+            </w:r>
+          </w:p>
+        </w:tc>
+        <w:tc>
+          <w:tcPr>
+            <w:tcW w:type="dxa" w:w="2340"/>
+          </w:tcPr>
+          <w:p>
+            <w:r/>
+            <w:r>
+              <w:rPr>
+                <w:sz w:val="16"/>
+              </w:rPr>
+              <w:t>green</w:t>
+            </w:r>
+          </w:p>
+        </w:tc>
+        <w:tc>
+          <w:tcPr>
+            <w:tcW w:type="dxa" w:w="2340"/>
+          </w:tcPr>
+          <w:p>
+            <w:r/>
+            <w:r>
+              <w:rPr>
+                <w:sz w:val="16"/>
+              </w:rPr>
+              <w:t>Cell wall biogenesis</w:t>
+            </w:r>
+          </w:p>
+        </w:tc>
+        <w:tc>
+          <w:tcPr>
+            <w:tcW w:type="dxa" w:w="2340"/>
+          </w:tcPr>
+          <w:p>
+            <w:r/>
+            <w:r>
+              <w:rPr>
+                <w:sz w:val="16"/>
+              </w:rPr>
+              <w:t>xyloglucan metabolic process; cell wall; xyloglucan:xyloglucosyl trans...</w:t>
+            </w:r>
+          </w:p>
+        </w:tc>
+      </w:tr>
+      <w:tr>
+        <w:tc>
+          <w:tcPr>
+            <w:tcW w:type="dxa" w:w="2340"/>
+          </w:tcPr>
+          <w:p>
+            <w:r/>
+            <w:r>
+              <w:rPr>
+                <w:sz w:val="16"/>
+              </w:rPr>
+              <w:t>Adv-Root</w:t>
+            </w:r>
+          </w:p>
+        </w:tc>
+        <w:tc>
+          <w:tcPr>
+            <w:tcW w:type="dxa" w:w="2340"/>
+          </w:tcPr>
+          <w:p>
+            <w:r/>
+            <w:r>
+              <w:rPr>
+                <w:sz w:val="16"/>
+              </w:rPr>
+              <w:t>greenyellow</w:t>
+            </w:r>
+          </w:p>
+        </w:tc>
+        <w:tc>
+          <w:tcPr>
+            <w:tcW w:type="dxa" w:w="2340"/>
+          </w:tcPr>
+          <w:p>
+            <w:r/>
+            <w:r>
+              <w:rPr>
+                <w:sz w:val="16"/>
+              </w:rPr>
+              <w:t>Microtubule / nucleus</w:t>
+            </w:r>
+          </w:p>
+        </w:tc>
+        <w:tc>
+          <w:tcPr>
+            <w:tcW w:type="dxa" w:w="2340"/>
+          </w:tcPr>
+          <w:p>
+            <w:r/>
+            <w:r>
+              <w:rPr>
+                <w:sz w:val="16"/>
+              </w:rPr>
+              <w:t>microtubule binding; ATP binding; nucleus</w:t>
+            </w:r>
+          </w:p>
+        </w:tc>
+      </w:tr>
+      <w:tr>
+        <w:tc>
+          <w:tcPr>
+            <w:tcW w:type="dxa" w:w="2340"/>
+          </w:tcPr>
+          <w:p>
+            <w:r/>
+            <w:r>
+              <w:rPr>
+                <w:sz w:val="16"/>
+              </w:rPr>
+              <w:t>Adv-Root</w:t>
+            </w:r>
+          </w:p>
+        </w:tc>
+        <w:tc>
+          <w:tcPr>
+            <w:tcW w:type="dxa" w:w="2340"/>
+          </w:tcPr>
+          <w:p>
+            <w:r/>
+            <w:r>
+              <w:rPr>
+                <w:sz w:val="16"/>
+              </w:rPr>
+              <w:t>lightcyan</w:t>
+            </w:r>
+          </w:p>
+        </w:tc>
+        <w:tc>
+          <w:tcPr>
+            <w:tcW w:type="dxa" w:w="2340"/>
+          </w:tcPr>
+          <w:p>
+            <w:r/>
+            <w:r>
+              <w:rPr>
+                <w:sz w:val="16"/>
+              </w:rPr>
+              <w:t>Protein phosphorylation</w:t>
+            </w:r>
+          </w:p>
+        </w:tc>
+        <w:tc>
+          <w:tcPr>
+            <w:tcW w:type="dxa" w:w="2340"/>
+          </w:tcPr>
+          <w:p>
+            <w:r/>
+            <w:r>
+              <w:rPr>
+                <w:sz w:val="16"/>
+              </w:rPr>
+              <w:t>protein phosphorylation; protein kinase activity; ATP binding</w:t>
+            </w:r>
+          </w:p>
+        </w:tc>
+      </w:tr>
+      <w:tr>
+        <w:tc>
+          <w:tcPr>
+            <w:tcW w:type="dxa" w:w="2340"/>
+          </w:tcPr>
+          <w:p>
+            <w:r/>
+            <w:r>
+              <w:rPr>
+                <w:sz w:val="16"/>
+              </w:rPr>
+              <w:t>Adv-Root</w:t>
+            </w:r>
+          </w:p>
+        </w:tc>
+        <w:tc>
+          <w:tcPr>
+            <w:tcW w:type="dxa" w:w="2340"/>
+          </w:tcPr>
+          <w:p>
+            <w:r/>
+            <w:r>
+              <w:rPr>
+                <w:sz w:val="16"/>
+              </w:rPr>
+              <w:t>magenta</w:t>
+            </w:r>
+          </w:p>
+        </w:tc>
+        <w:tc>
+          <w:tcPr>
+            <w:tcW w:type="dxa" w:w="2340"/>
+          </w:tcPr>
+          <w:p>
+            <w:r/>
+            <w:r>
+              <w:rPr>
+                <w:sz w:val="16"/>
+              </w:rPr>
+              <w:t>Terpenoid biosynthesis</w:t>
+            </w:r>
+          </w:p>
+        </w:tc>
+        <w:tc>
+          <w:tcPr>
+            <w:tcW w:type="dxa" w:w="2340"/>
+          </w:tcPr>
+          <w:p>
+            <w:r/>
+            <w:r>
+              <w:rPr>
+                <w:sz w:val="16"/>
+              </w:rPr>
+              <w:t>acyltransferase activity; terpene synthase activity; terpenoid biosynt...</w:t>
+            </w:r>
+          </w:p>
+        </w:tc>
+      </w:tr>
+      <w:tr>
+        <w:tc>
+          <w:tcPr>
+            <w:tcW w:type="dxa" w:w="2340"/>
+          </w:tcPr>
+          <w:p>
+            <w:r/>
+            <w:r>
+              <w:rPr>
+                <w:sz w:val="16"/>
+              </w:rPr>
+              <w:t>Adv-Root</w:t>
+            </w:r>
+          </w:p>
+        </w:tc>
+        <w:tc>
+          <w:tcPr>
+            <w:tcW w:type="dxa" w:w="2340"/>
+          </w:tcPr>
+          <w:p>
+            <w:r/>
+            <w:r>
+              <w:rPr>
+                <w:sz w:val="16"/>
+              </w:rPr>
+              <w:t>midnightblue</w:t>
+            </w:r>
+          </w:p>
+        </w:tc>
+        <w:tc>
+          <w:tcPr>
+            <w:tcW w:type="dxa" w:w="2340"/>
+          </w:tcPr>
+          <w:p>
+            <w:r/>
+            <w:r>
+              <w:rPr>
+                <w:sz w:val="16"/>
+              </w:rPr>
+              <w:t>Membrane transport</w:t>
+            </w:r>
+          </w:p>
+        </w:tc>
+        <w:tc>
+          <w:tcPr>
+            <w:tcW w:type="dxa" w:w="2340"/>
+          </w:tcPr>
+          <w:p>
+            <w:r/>
+            <w:r>
+              <w:rPr>
+                <w:sz w:val="16"/>
+              </w:rPr>
+              <w:t>transmembrane transporter activity; transmembrane transport; membrane</w:t>
+            </w:r>
+          </w:p>
+        </w:tc>
+      </w:tr>
+      <w:tr>
+        <w:tc>
+          <w:tcPr>
+            <w:tcW w:type="dxa" w:w="2340"/>
+          </w:tcPr>
+          <w:p>
+            <w:r/>
+            <w:r>
+              <w:rPr>
+                <w:sz w:val="16"/>
+              </w:rPr>
+              <w:t>Adv-Root</w:t>
+            </w:r>
+          </w:p>
+        </w:tc>
+        <w:tc>
+          <w:tcPr>
+            <w:tcW w:type="dxa" w:w="2340"/>
+          </w:tcPr>
+          <w:p>
+            <w:r/>
+            <w:r>
+              <w:rPr>
+                <w:sz w:val="16"/>
+              </w:rPr>
+              <w:t>pink</w:t>
+            </w:r>
+          </w:p>
+        </w:tc>
+        <w:tc>
+          <w:tcPr>
+            <w:tcW w:type="dxa" w:w="2340"/>
+          </w:tcPr>
+          <w:p>
+            <w:r/>
+            <w:r>
+              <w:rPr>
+                <w:sz w:val="16"/>
+              </w:rPr>
+              <w:t>Transcription / ubiquitination</w:t>
+            </w:r>
+          </w:p>
+        </w:tc>
+        <w:tc>
+          <w:tcPr>
+            <w:tcW w:type="dxa" w:w="2340"/>
+          </w:tcPr>
+          <w:p>
+            <w:r/>
+            <w:r>
+              <w:rPr>
+                <w:sz w:val="16"/>
+              </w:rPr>
+              <w:t>DNA-binding transcription factor activity; ubiquitin protein ligase ac...</w:t>
+            </w:r>
+          </w:p>
+        </w:tc>
+      </w:tr>
+      <w:tr>
+        <w:tc>
+          <w:tcPr>
+            <w:tcW w:type="dxa" w:w="2340"/>
+          </w:tcPr>
+          <w:p>
+            <w:r/>
+            <w:r>
+              <w:rPr>
+                <w:sz w:val="16"/>
+              </w:rPr>
+              <w:t>Adv-Root</w:t>
+            </w:r>
+          </w:p>
+        </w:tc>
+        <w:tc>
+          <w:tcPr>
+            <w:tcW w:type="dxa" w:w="2340"/>
+          </w:tcPr>
+          <w:p>
+            <w:r/>
+            <w:r>
+              <w:rPr>
+                <w:sz w:val="16"/>
+              </w:rPr>
+              <w:t>purple</w:t>
+            </w:r>
+          </w:p>
+        </w:tc>
+        <w:tc>
+          <w:tcPr>
+            <w:tcW w:type="dxa" w:w="2340"/>
+          </w:tcPr>
+          <w:p>
+            <w:r/>
+            <w:r>
+              <w:rPr>
+                <w:sz w:val="16"/>
+              </w:rPr>
+              <w:t>Cellulose biosynthesis</w:t>
+            </w:r>
+          </w:p>
+        </w:tc>
+        <w:tc>
+          <w:tcPr>
+            <w:tcW w:type="dxa" w:w="2340"/>
+          </w:tcPr>
+          <w:p>
+            <w:r/>
+            <w:r>
+              <w:rPr>
+                <w:sz w:val="16"/>
+              </w:rPr>
+              <w:t>cellulose synthase (UDP-forming) activity; cellulose biosynthetic proc...</w:t>
+            </w:r>
+          </w:p>
+        </w:tc>
+      </w:tr>
+      <w:tr>
+        <w:tc>
+          <w:tcPr>
+            <w:tcW w:type="dxa" w:w="2340"/>
+          </w:tcPr>
+          <w:p>
+            <w:r/>
+            <w:r>
+              <w:rPr>
+                <w:sz w:val="16"/>
+              </w:rPr>
+              <w:t>Adv-Root</w:t>
+            </w:r>
+          </w:p>
+        </w:tc>
+        <w:tc>
+          <w:tcPr>
+            <w:tcW w:type="dxa" w:w="2340"/>
+          </w:tcPr>
+          <w:p>
+            <w:r/>
+            <w:r>
+              <w:rPr>
+                <w:sz w:val="16"/>
+              </w:rPr>
+              <w:t>salmon</w:t>
+            </w:r>
+          </w:p>
+        </w:tc>
+        <w:tc>
+          <w:tcPr>
+            <w:tcW w:type="dxa" w:w="2340"/>
+          </w:tcPr>
+          <w:p>
+            <w:r/>
+            <w:r>
+              <w:rPr>
+                <w:sz w:val="16"/>
+              </w:rPr>
+              <w:t>Cell cycle / mitosis</w:t>
+            </w:r>
+          </w:p>
+        </w:tc>
+        <w:tc>
+          <w:tcPr>
+            <w:tcW w:type="dxa" w:w="2340"/>
+          </w:tcPr>
+          <w:p>
+            <w:r/>
+            <w:r>
+              <w:rPr>
+                <w:sz w:val="16"/>
+              </w:rPr>
+              <w:t>cyclin-dependent protein serine/threonine kinase regulator activity; m...</w:t>
+            </w:r>
+          </w:p>
+        </w:tc>
+      </w:tr>
+      <w:tr>
+        <w:tc>
+          <w:tcPr>
+            <w:tcW w:type="dxa" w:w="2340"/>
+          </w:tcPr>
+          <w:p>
+            <w:r/>
+            <w:r>
+              <w:rPr>
+                <w:sz w:val="16"/>
+              </w:rPr>
+              <w:t>Adv-Root</w:t>
+            </w:r>
+          </w:p>
+        </w:tc>
+        <w:tc>
+          <w:tcPr>
+            <w:tcW w:type="dxa" w:w="2340"/>
+          </w:tcPr>
+          <w:p>
+            <w:r/>
+            <w:r>
+              <w:rPr>
+                <w:sz w:val="16"/>
+              </w:rPr>
+              <w:t>turquoise</w:t>
+            </w:r>
+          </w:p>
+        </w:tc>
+        <w:tc>
+          <w:tcPr>
+            <w:tcW w:type="dxa" w:w="2340"/>
+          </w:tcPr>
+          <w:p>
+            <w:r/>
+            <w:r>
+              <w:rPr>
+                <w:sz w:val="16"/>
+              </w:rPr>
+              <w:t>Oxidative stress (peroxidase)</w:t>
+            </w:r>
+          </w:p>
+        </w:tc>
+        <w:tc>
+          <w:tcPr>
+            <w:tcW w:type="dxa" w:w="2340"/>
+          </w:tcPr>
+          <w:p>
+            <w:r/>
+            <w:r>
+              <w:rPr>
+                <w:sz w:val="16"/>
+              </w:rPr>
+              <w:t>peroxidase activity; hydrogen peroxide catabolic process; heme binding</w:t>
+            </w:r>
+          </w:p>
+        </w:tc>
+      </w:tr>
+      <w:tr>
+        <w:tc>
+          <w:tcPr>
+            <w:tcW w:type="dxa" w:w="2340"/>
+          </w:tcPr>
+          <w:p>
+            <w:r/>
+            <w:r>
+              <w:rPr>
+                <w:sz w:val="16"/>
+              </w:rPr>
+              <w:t>Leaf</w:t>
+            </w:r>
+          </w:p>
+        </w:tc>
+        <w:tc>
+          <w:tcPr>
+            <w:tcW w:type="dxa" w:w="2340"/>
+          </w:tcPr>
+          <w:p>
+            <w:r/>
+            <w:r>
+              <w:rPr>
+                <w:sz w:val="16"/>
+              </w:rPr>
+              <w:t>black</w:t>
+            </w:r>
+          </w:p>
+        </w:tc>
+        <w:tc>
+          <w:tcPr>
+            <w:tcW w:type="dxa" w:w="2340"/>
+          </w:tcPr>
+          <w:p>
+            <w:r/>
+            <w:r>
+              <w:rPr>
+                <w:sz w:val="16"/>
+              </w:rPr>
+              <w:t>Photosynthesis &amp; ribosome</w:t>
+            </w:r>
+          </w:p>
+        </w:tc>
+        <w:tc>
+          <w:tcPr>
+            <w:tcW w:type="dxa" w:w="2340"/>
+          </w:tcPr>
+          <w:p>
+            <w:r/>
+            <w:r>
+              <w:rPr>
+                <w:sz w:val="16"/>
+              </w:rPr>
+              <w:t>photosynthesis; ribosome; photosystem I</w:t>
+            </w:r>
+          </w:p>
+        </w:tc>
+      </w:tr>
+      <w:tr>
+        <w:tc>
+          <w:tcPr>
+            <w:tcW w:type="dxa" w:w="2340"/>
+          </w:tcPr>
+          <w:p>
+            <w:r/>
+            <w:r>
+              <w:rPr>
+                <w:sz w:val="16"/>
+              </w:rPr>
+              <w:t>Leaf</w:t>
+            </w:r>
+          </w:p>
+        </w:tc>
+        <w:tc>
+          <w:tcPr>
+            <w:tcW w:type="dxa" w:w="2340"/>
+          </w:tcPr>
+          <w:p>
+            <w:r/>
+            <w:r>
+              <w:rPr>
+                <w:sz w:val="16"/>
+              </w:rPr>
+              <w:t>blue</w:t>
+            </w:r>
+          </w:p>
+        </w:tc>
+        <w:tc>
+          <w:tcPr>
+            <w:tcW w:type="dxa" w:w="2340"/>
+          </w:tcPr>
+          <w:p>
+            <w:r/>
+            <w:r>
+              <w:rPr>
+                <w:sz w:val="16"/>
+              </w:rPr>
+              <w:t>Phosphate starvation / transport</w:t>
+            </w:r>
+          </w:p>
+        </w:tc>
+        <w:tc>
+          <w:tcPr>
+            <w:tcW w:type="dxa" w:w="2340"/>
+          </w:tcPr>
+          <w:p>
+            <w:r/>
+            <w:r>
+              <w:rPr>
+                <w:sz w:val="16"/>
+              </w:rPr>
+              <w:t>DNA-binding transcription factor activity; cellular response to phosph...</w:t>
+            </w:r>
+          </w:p>
+        </w:tc>
+      </w:tr>
+      <w:tr>
+        <w:tc>
+          <w:tcPr>
+            <w:tcW w:type="dxa" w:w="2340"/>
+          </w:tcPr>
+          <w:p>
+            <w:r/>
+            <w:r>
+              <w:rPr>
+                <w:sz w:val="16"/>
+              </w:rPr>
+              <w:t>Leaf</w:t>
+            </w:r>
+          </w:p>
+        </w:tc>
+        <w:tc>
+          <w:tcPr>
+            <w:tcW w:type="dxa" w:w="2340"/>
+          </w:tcPr>
+          <w:p>
+            <w:r/>
+            <w:r>
+              <w:rPr>
+                <w:sz w:val="16"/>
+              </w:rPr>
+              <w:t>brown</w:t>
+            </w:r>
+          </w:p>
+        </w:tc>
+        <w:tc>
+          <w:tcPr>
+            <w:tcW w:type="dxa" w:w="2340"/>
+          </w:tcPr>
+          <w:p>
+            <w:r/>
+            <w:r>
+              <w:rPr>
+                <w:sz w:val="16"/>
+              </w:rPr>
+              <w:t>Lignin / phenolic metabolism</w:t>
+            </w:r>
+          </w:p>
+        </w:tc>
+        <w:tc>
+          <w:tcPr>
+            <w:tcW w:type="dxa" w:w="2340"/>
+          </w:tcPr>
+          <w:p>
+            <w:r/>
+            <w:r>
+              <w:rPr>
+                <w:sz w:val="16"/>
+              </w:rPr>
+              <w:t>heme binding; endopeptidase inhibitor activity; cation binding</w:t>
+            </w:r>
+          </w:p>
+        </w:tc>
+      </w:tr>
+      <w:tr>
+        <w:tc>
+          <w:tcPr>
+            <w:tcW w:type="dxa" w:w="2340"/>
+          </w:tcPr>
+          <w:p>
+            <w:r/>
+            <w:r>
+              <w:rPr>
+                <w:sz w:val="16"/>
+              </w:rPr>
+              <w:t>Leaf</w:t>
+            </w:r>
+          </w:p>
+        </w:tc>
+        <w:tc>
+          <w:tcPr>
+            <w:tcW w:type="dxa" w:w="2340"/>
+          </w:tcPr>
+          <w:p>
+            <w:r/>
+            <w:r>
+              <w:rPr>
+                <w:sz w:val="16"/>
+              </w:rPr>
+              <w:t>green</w:t>
+            </w:r>
+          </w:p>
+        </w:tc>
+        <w:tc>
+          <w:tcPr>
+            <w:tcW w:type="dxa" w:w="2340"/>
+          </w:tcPr>
+          <w:p>
+            <w:r/>
+            <w:r>
+              <w:rPr>
+                <w:sz w:val="16"/>
+              </w:rPr>
+              <w:t>Protein ubiquitination</w:t>
+            </w:r>
+          </w:p>
+        </w:tc>
+        <w:tc>
+          <w:tcPr>
+            <w:tcW w:type="dxa" w:w="2340"/>
+          </w:tcPr>
+          <w:p>
+            <w:r/>
+            <w:r>
+              <w:rPr>
+                <w:sz w:val="16"/>
+              </w:rPr>
+              <w:t>protein ubiquitination; ubiquitin-protein transferase activity; cell s...</w:t>
+            </w:r>
+          </w:p>
+        </w:tc>
+      </w:tr>
+      <w:tr>
+        <w:tc>
+          <w:tcPr>
+            <w:tcW w:type="dxa" w:w="2340"/>
+          </w:tcPr>
+          <w:p>
+            <w:r/>
+            <w:r>
+              <w:rPr>
+                <w:sz w:val="16"/>
+              </w:rPr>
+              <w:t>Leaf</w:t>
+            </w:r>
+          </w:p>
+        </w:tc>
+        <w:tc>
+          <w:tcPr>
+            <w:tcW w:type="dxa" w:w="2340"/>
+          </w:tcPr>
+          <w:p>
+            <w:r/>
+            <w:r>
+              <w:rPr>
+                <w:sz w:val="16"/>
+              </w:rPr>
+              <w:t>greenyellow</w:t>
+            </w:r>
+          </w:p>
+        </w:tc>
+        <w:tc>
+          <w:tcPr>
+            <w:tcW w:type="dxa" w:w="2340"/>
+          </w:tcPr>
+          <w:p>
+            <w:r/>
+            <w:r>
+              <w:rPr>
+                <w:sz w:val="16"/>
+              </w:rPr>
+              <w:t>Chitinase / defense</w:t>
+            </w:r>
+          </w:p>
+        </w:tc>
+        <w:tc>
+          <w:tcPr>
+            <w:tcW w:type="dxa" w:w="2340"/>
+          </w:tcPr>
+          <w:p>
+            <w:r/>
+            <w:r>
+              <w:rPr>
+                <w:sz w:val="16"/>
+              </w:rPr>
+              <w:t>chitinase activity; chitin catabolic process; chitin binding</w:t>
+            </w:r>
+          </w:p>
+        </w:tc>
+      </w:tr>
+      <w:tr>
+        <w:tc>
+          <w:tcPr>
+            <w:tcW w:type="dxa" w:w="2340"/>
+          </w:tcPr>
+          <w:p>
+            <w:r/>
+            <w:r>
+              <w:rPr>
+                <w:sz w:val="16"/>
+              </w:rPr>
+              <w:t>Leaf</w:t>
+            </w:r>
+          </w:p>
+        </w:tc>
+        <w:tc>
+          <w:tcPr>
+            <w:tcW w:type="dxa" w:w="2340"/>
+          </w:tcPr>
+          <w:p>
+            <w:r/>
+            <w:r>
+              <w:rPr>
+                <w:sz w:val="16"/>
+              </w:rPr>
+              <w:t>magenta</w:t>
+            </w:r>
+          </w:p>
+        </w:tc>
+        <w:tc>
+          <w:tcPr>
+            <w:tcW w:type="dxa" w:w="2340"/>
+          </w:tcPr>
+          <w:p>
+            <w:r/>
+            <w:r>
+              <w:rPr>
+                <w:sz w:val="16"/>
+              </w:rPr>
+              <w:t>Transcription / ethylene</w:t>
+            </w:r>
+          </w:p>
+        </w:tc>
+        <w:tc>
+          <w:tcPr>
+            <w:tcW w:type="dxa" w:w="2340"/>
+          </w:tcPr>
+          <w:p>
+            <w:r/>
+            <w:r>
+              <w:rPr>
+                <w:sz w:val="16"/>
+              </w:rPr>
+              <w:t>regulation of DNA-templated transcription; ethylene-activated signalin...</w:t>
+            </w:r>
+          </w:p>
+        </w:tc>
+      </w:tr>
+      <w:tr>
+        <w:tc>
+          <w:tcPr>
+            <w:tcW w:type="dxa" w:w="2340"/>
+          </w:tcPr>
+          <w:p>
+            <w:r/>
+            <w:r>
+              <w:rPr>
+                <w:sz w:val="16"/>
+              </w:rPr>
+              <w:t>Leaf</w:t>
+            </w:r>
+          </w:p>
+        </w:tc>
+        <w:tc>
+          <w:tcPr>
+            <w:tcW w:type="dxa" w:w="2340"/>
+          </w:tcPr>
+          <w:p>
+            <w:r/>
+            <w:r>
+              <w:rPr>
+                <w:sz w:val="16"/>
+              </w:rPr>
+              <w:t>pink</w:t>
+            </w:r>
+          </w:p>
+        </w:tc>
+        <w:tc>
+          <w:tcPr>
+            <w:tcW w:type="dxa" w:w="2340"/>
+          </w:tcPr>
+          <w:p>
+            <w:r/>
+            <w:r>
+              <w:rPr>
+                <w:sz w:val="16"/>
+              </w:rPr>
+              <w:t>Cell wall / glucan</w:t>
+            </w:r>
+          </w:p>
+        </w:tc>
+        <w:tc>
+          <w:tcPr>
+            <w:tcW w:type="dxa" w:w="2340"/>
+          </w:tcPr>
+          <w:p>
+            <w:r/>
+            <w:r>
+              <w:rPr>
+                <w:sz w:val="16"/>
+              </w:rPr>
+              <w:t>cell wall; xyloglucan:xyloglucosyl transferase activity; glucan metabo...</w:t>
+            </w:r>
+          </w:p>
+        </w:tc>
+      </w:tr>
+      <w:tr>
+        <w:tc>
+          <w:tcPr>
+            <w:tcW w:type="dxa" w:w="2340"/>
+          </w:tcPr>
+          <w:p>
+            <w:r/>
+            <w:r>
+              <w:rPr>
+                <w:sz w:val="16"/>
+              </w:rPr>
+              <w:t>Leaf</w:t>
+            </w:r>
+          </w:p>
+        </w:tc>
+        <w:tc>
+          <w:tcPr>
+            <w:tcW w:type="dxa" w:w="2340"/>
+          </w:tcPr>
+          <w:p>
+            <w:r/>
+            <w:r>
+              <w:rPr>
+                <w:sz w:val="16"/>
+              </w:rPr>
+              <w:t>purple</w:t>
+            </w:r>
+          </w:p>
+        </w:tc>
+        <w:tc>
+          <w:tcPr>
+            <w:tcW w:type="dxa" w:w="2340"/>
+          </w:tcPr>
+          <w:p>
+            <w:r/>
+            <w:r>
+              <w:rPr>
+                <w:sz w:val="16"/>
+              </w:rPr>
+              <w:t>Fe–S cluster / biosynthesis</w:t>
+            </w:r>
+          </w:p>
+        </w:tc>
+        <w:tc>
+          <w:tcPr>
+            <w:tcW w:type="dxa" w:w="2340"/>
+          </w:tcPr>
+          <w:p>
+            <w:r/>
+            <w:r>
+              <w:rPr>
+                <w:sz w:val="16"/>
+              </w:rPr>
+              <w:t>iron-sulfur cluster binding; biosynthetic process</w:t>
+            </w:r>
+          </w:p>
+        </w:tc>
+      </w:tr>
+      <w:tr>
+        <w:tc>
+          <w:tcPr>
+            <w:tcW w:type="dxa" w:w="2340"/>
+          </w:tcPr>
+          <w:p>
+            <w:r/>
+            <w:r>
+              <w:rPr>
+                <w:sz w:val="16"/>
+              </w:rPr>
+              <w:t>Leaf</w:t>
+            </w:r>
+          </w:p>
+        </w:tc>
+        <w:tc>
+          <w:tcPr>
+            <w:tcW w:type="dxa" w:w="2340"/>
+          </w:tcPr>
+          <w:p>
+            <w:r/>
+            <w:r>
+              <w:rPr>
+                <w:sz w:val="16"/>
+              </w:rPr>
+              <w:t>red</w:t>
+            </w:r>
+          </w:p>
+        </w:tc>
+        <w:tc>
+          <w:tcPr>
+            <w:tcW w:type="dxa" w:w="2340"/>
+          </w:tcPr>
+          <w:p>
+            <w:r/>
+            <w:r>
+              <w:rPr>
+                <w:sz w:val="16"/>
+              </w:rPr>
+              <w:t>RNA processing</w:t>
+            </w:r>
+          </w:p>
+        </w:tc>
+        <w:tc>
+          <w:tcPr>
+            <w:tcW w:type="dxa" w:w="2340"/>
+          </w:tcPr>
+          <w:p>
+            <w:r/>
+            <w:r>
+              <w:rPr>
+                <w:sz w:val="16"/>
+              </w:rPr>
+              <w:t>RNA binding; protein binding; RNA modification</w:t>
+            </w:r>
+          </w:p>
+        </w:tc>
+      </w:tr>
+      <w:tr>
+        <w:tc>
+          <w:tcPr>
+            <w:tcW w:type="dxa" w:w="2340"/>
+          </w:tcPr>
+          <w:p>
+            <w:r/>
+            <w:r>
+              <w:rPr>
+                <w:sz w:val="16"/>
+              </w:rPr>
+              <w:t>Leaf</w:t>
+            </w:r>
+          </w:p>
+        </w:tc>
+        <w:tc>
+          <w:tcPr>
+            <w:tcW w:type="dxa" w:w="2340"/>
+          </w:tcPr>
+          <w:p>
+            <w:r/>
+            <w:r>
+              <w:rPr>
+                <w:sz w:val="16"/>
+              </w:rPr>
+              <w:t>tan</w:t>
+            </w:r>
+          </w:p>
+        </w:tc>
+        <w:tc>
+          <w:tcPr>
+            <w:tcW w:type="dxa" w:w="2340"/>
+          </w:tcPr>
+          <w:p>
+            <w:r/>
+            <w:r>
+              <w:rPr>
+                <w:sz w:val="16"/>
+              </w:rPr>
+              <w:t>Oxidative stress (peroxidase)</w:t>
+            </w:r>
+          </w:p>
+        </w:tc>
+        <w:tc>
+          <w:tcPr>
+            <w:tcW w:type="dxa" w:w="2340"/>
+          </w:tcPr>
+          <w:p>
+            <w:r/>
+            <w:r>
+              <w:rPr>
+                <w:sz w:val="16"/>
+              </w:rPr>
+              <w:t>hydrogen peroxide catabolic process; peroxidase activity; response to ...</w:t>
+            </w:r>
+          </w:p>
+        </w:tc>
+      </w:tr>
+      <w:tr>
+        <w:tc>
+          <w:tcPr>
+            <w:tcW w:type="dxa" w:w="2340"/>
+          </w:tcPr>
+          <w:p>
+            <w:r/>
+            <w:r>
+              <w:rPr>
+                <w:sz w:val="16"/>
+              </w:rPr>
+              <w:t>Leaf</w:t>
+            </w:r>
+          </w:p>
+        </w:tc>
+        <w:tc>
+          <w:tcPr>
+            <w:tcW w:type="dxa" w:w="2340"/>
+          </w:tcPr>
+          <w:p>
+            <w:r/>
+            <w:r>
+              <w:rPr>
+                <w:sz w:val="16"/>
+              </w:rPr>
+              <w:t>turquoise</w:t>
+            </w:r>
+          </w:p>
+        </w:tc>
+        <w:tc>
+          <w:tcPr>
+            <w:tcW w:type="dxa" w:w="2340"/>
+          </w:tcPr>
+          <w:p>
+            <w:r/>
+            <w:r>
+              <w:rPr>
+                <w:sz w:val="16"/>
+              </w:rPr>
+              <w:t>Chromatin / nucleosome</w:t>
+            </w:r>
+          </w:p>
+        </w:tc>
+        <w:tc>
+          <w:tcPr>
+            <w:tcW w:type="dxa" w:w="2340"/>
+          </w:tcPr>
+          <w:p>
+            <w:r/>
+            <w:r>
+              <w:rPr>
+                <w:sz w:val="16"/>
+              </w:rPr>
+              <w:t>nucleosome; structural constituent of chromatin; microtubule binding</w:t>
+            </w:r>
+          </w:p>
+        </w:tc>
+      </w:tr>
+    </w:tbl>
     <w:p>
       <w:pPr>
         <w:pStyle w:val="Heading2"/>
@@ -884,7 +2372,7 @@
       <w:r>
         <w:drawing>
           <wp:inline xmlns:a="http://schemas.openxmlformats.org/drawingml/2006/main" xmlns:pic="http://schemas.openxmlformats.org/drawingml/2006/picture">
-            <wp:extent cx="5760720" cy="4608576"/>
+            <wp:extent cx="5760720" cy="4531368"/>
             <wp:docPr id="11" name="Picture 11"/>
             <wp:cNvGraphicFramePr>
               <a:graphicFrameLocks noChangeAspect="1"/>
@@ -905,7 +2393,7 @@
                   <pic:spPr>
                     <a:xfrm>
                       <a:off x="0" y="0"/>
-                      <a:ext cx="5760720" cy="4608576"/>
+                      <a:ext cx="5760720" cy="4531368"/>
                     </a:xfrm>
                     <a:prstGeom prst="rect"/>
                   </pic:spPr>
@@ -924,7 +2412,7 @@
         <w:t>*Figure 6.</w:t>
       </w:r>
       <w:r>
-        <w:t xml:space="preserve"> Bipartite module–taxon network linking flight-associated modules to Methylobacterium, Burkholderia, Azospirillum.*</w:t>
+        <w:t xml:space="preserve"> Significant leaf module–taxon correlations (BH padj&lt;0.05); modules carry their GO-biology labels (Table 1). The flight-associated turquoise (chromatin/nucleosome) module positively tracks Methylobacterium, Burkholderia and Azospirillum, while the blue (phosphate-starvation) module shows the inverse.*</w:t>
       </w:r>
     </w:p>
     <w:p>
@@ -1233,7 +2721,7 @@
         <w:t>Figure 4 (Leaf).</w:t>
       </w:r>
       <w:r>
-        <w:t xml:space="preserve"> WGCNA module–trait correlations (flight, light, 16S/ITS dysbiosis).</w:t>
+        <w:t xml:space="preserve"> WGCNA module–trait correlations (flight, light, 16S/ITS dysbiosis). Each module is labelled with its dominant GO biology (Table 1); cells show Spearman rho with significance stars.</w:t>
       </w:r>
     </w:p>
     <w:p>
@@ -1247,7 +2735,7 @@
         <w:t>Figure 4 (Adv-Root).</w:t>
       </w:r>
       <w:r>
-        <w:t xml:space="preserve"> Module–trait correlations; the black module tracks ITS dysbiosis (r=−0.85) but not flight.</w:t>
+        <w:t xml:space="preserve"> Module–trait correlations with GO-biology labels (Table 1). The black (nucleus) module tracks ITS dysbiosis (r=−0.85) but not flight; the turquoise (oxidative-stress/peroxidase) module is the largest flight-correlated module.</w:t>
       </w:r>
     </w:p>
     <w:p>
@@ -1289,7 +2777,7 @@
         <w:t>Figure 6.</w:t>
       </w:r>
       <w:r>
-        <w:t xml:space="preserve"> Bipartite module–taxon network linking flight-associated modules to Methylobacterium, Burkholderia, Azospirillum.</w:t>
+        <w:t xml:space="preserve"> Significant leaf module–taxon correlations (BH padj&lt;0.05); modules carry their GO-biology labels (Table 1). The flight-associated turquoise (chromatin/nucleosome) module positively tracks Methylobacterium, Burkholderia and Azospirillum, while the blue (phosphate-starvation) module shows the inverse.</w:t>
       </w:r>
     </w:p>
     <w:p>

</xml_diff>

<commit_message>
Correct black-module GO attribution in Results + Discussion
Deposited GO shows the Adv-Root black module enriched only for 'nucleus'; the
oxidative-stress program (peroxidase/H2O2) is the turquoise module. Text now matches
the data and Fig 4/Table 1; the microbe-driven finding (r=-0.85 with ITS dysbiosis) is unchanged.

Co-Authored-By: Claude Opus 4.8 <noreply@anthropic.com>
</commit_message>
<xml_diff>
--- a/manuscript_with_figures.docx
+++ b/manuscript_with_figures.docx
@@ -593,7 +593,7 @@
     </w:p>
     <w:p>
       <w:r>
-        <w:t>In adventitious roots, WGCNA identified 17 modules (power=18). The key finding was the black module (n=169 genes), which was strongly correlated with ITS dysbiosis (r=−0.85, padj=0.001) but not with flight status (r=−0.38, p=0.32). This module was classified as microbe-driven, representing a host transcriptional response to fungal community changes that is independent of the direct spaceflight stimulus. GO enrichment of this module revealed enrichment for oxidative stress response genes, including peroxidase activity and hydrogen peroxide catabolism.</w:t>
+        <w:t>In adventitious roots, WGCNA identified 17 modules (power=18). The key finding was the black module (n=169 genes), which was strongly correlated with ITS dysbiosis (r=−0.85, padj=0.001) but not with flight status (r=−0.38, p=0.32). This module was classified as microbe-driven, representing a host transcriptional response to fungal community changes that is independent of the direct spaceflight stimulus. GO enrichment of the black module itself was limited — its only significantly enriched term was the cellular component "nucleus" — so it is defined here by its microbe-driven trait association rather than by a specific enriched process; the adventitious-root oxidative-stress program was instead concentrated in the larger turquoise module (see below).</w:t>
       </w:r>
     </w:p>
     <w:p>
@@ -2571,7 +2571,7 @@
     </w:p>
     <w:p>
       <w:r>
-        <w:t>The identification of a microbe-driven WGCNA module in adventitious roots (black module, 169 genes) is perhaps the most significant finding. This module's strong correlation with fungal dysbiosis (r=−0.85) but not with flight status (r=−0.38, p=0.32) indicates that the host transcriptional response in this module is driven by microbial community changes rather than directly by the spaceflight environment. The enrichment of oxidative stress genes in this module suggests that fungal community restructuring may trigger host defense responses, potentially through oxidative burst signaling.</w:t>
+        <w:t>The identification of a microbe-driven WGCNA module in adventitious roots (black module, 169 genes) is perhaps the most significant finding. This module's strong correlation with fungal dysbiosis (r=−0.85) but not with flight status (r=−0.38, p=0.32) indicates that the host transcriptional response in this module is driven by microbial community changes rather than directly by the spaceflight environment. Although the black module's own GO enrichment was limited (its only enriched term was "nucleus"), the broader adventitious-root oxidative-stress program — concentrated in the larger turquoise module — together with the black module's tight coupling to fungal dysbiosis suggests that fungal community restructuring may trigger host defense and redox responses, potentially through oxidative burst signaling.</w:t>
       </w:r>
     </w:p>
     <w:p>

</xml_diff>

<commit_message>
QC pass: add figure callouts (Figs 3-7), fill GitHub URL, pre-wire Zenodo badge
Co-Authored-By: Claude Opus 4.8 <noreply@anthropic.com>
</commit_message>
<xml_diff>
--- a/manuscript_with_figures.docx
+++ b/manuscript_with_figures.docx
@@ -194,7 +194,7 @@
     </w:p>
     <w:p>
       <w:r>
-        <w:t>All analysis code is available at [GitHub repository URL]. Raw data are available from NASA OSDR (OSD-766, OSD-767).</w:t>
+        <w:t>All analysis code is available at https://github.com/dr-richard-barker/veg05-integrated-omics. Raw data are available from NASA OSDR (OSD-766, OSD-767).</w:t>
       </w:r>
     </w:p>
     <w:p>
@@ -420,12 +420,12 @@
     </w:p>
     <w:p>
       <w:r>
-        <w:t>DESeq2 analysis revealed a pronounced interaction between spaceflight and light quality (Table S2). In leaves, the main flight effect comprised 757 DEGs (404 up, 353 down), but the flight effect under blue light was nearly 9-fold larger (4,716 DEGs) than under red light (523 DEGs). The formal interaction term identified 3,189 DEGs, confirming that the transcriptional response to spaceflight is strongly modulated by light quality.</w:t>
+        <w:t>DESeq2 analysis revealed a pronounced interaction between spaceflight and light quality (Table S2). In leaves, the main flight effect comprised 757 DEGs (404 up, 353 down; Fig. 3B), but the flight effect under blue light was nearly 9-fold larger (4,716 DEGs) than under red light (523 DEGs) (Fig. 3). The formal interaction term identified 3,189 DEGs, confirming that the transcriptional response to spaceflight is strongly modulated by light quality.</w:t>
       </w:r>
     </w:p>
     <w:p>
       <w:r>
-        <w:t>In adventitious roots, the flight response was predominantly upregulation (896 DEGs: 783 up, 113 down, 87% upregulated), suggesting activation of stress response pathways. The interaction was minimal (6 DEGs after shrinkage), indicating that the root transcriptional response to spaceflight is less light-dependent than the leaf response.</w:t>
+        <w:t>In adventitious roots, the flight response was predominantly upregulation (896 DEGs: 783 up, 113 down, 87% upregulated; Fig. 3C), suggesting activation of stress response pathways. The interaction was minimal (6 DEGs after shrinkage), indicating that the root transcriptional response to spaceflight is less light-dependent than the leaf response.</w:t>
       </w:r>
     </w:p>
     <w:p>
@@ -588,7 +588,7 @@
     </w:p>
     <w:p>
       <w:r>
-        <w:t>WGCNA of the leaf transcriptome identified 13 modules (power=20), with the turquoise module (n=2,037 genes) showing the strongest flight correlation (r=+0.73, padj=0.001) and the blue module (n=1,012) showing the strongest anti-correlation (r=−0.79, padj=3×10⁻⁴). Four leaf modules were classified as co-regulated (correlated with both flight and dysbiosis), reflecting the intertwined nature of environmental and microbial signals.</w:t>
+        <w:t>WGCNA of the leaf transcriptome identified 13 modules (power=20; Fig. 4), with the turquoise module (n=2,037 genes) showing the strongest flight correlation (r=+0.73, padj=0.001) and the blue module (n=1,012) showing the strongest anti-correlation (r=−0.79, padj=3×10⁻⁴). Four leaf modules were classified as co-regulated (correlated with both flight and dysbiosis), reflecting the intertwined nature of environmental and microbial signals.</w:t>
       </w:r>
     </w:p>
     <w:p>
@@ -2199,7 +2199,7 @@
     </w:p>
     <w:p>
       <w:r>
-        <w:t>MOFA+ integration of 21 matched leaf samples across three omics views (transcriptome: 2,000 genes; 16S: 348 ASVs; ITS: 77 ASVs) identified 5 factors. Factor 1 was the dominant signal, explaining 48.0% of transcriptome variance, 12.0% of 16S variance, and 3.0% of ITS variance. Factor 1 was significantly correlated with flight status (Spearman ρ=−0.76, padj=0.001), confirming that spaceflight is the primary axis of coordinated variation across omics layers.</w:t>
+        <w:t>MOFA+ integration of 21 matched leaf samples across three omics views (transcriptome: 2,000 genes; 16S: 348 ASVs; ITS: 77 ASVs) identified 5 factors. Factor 1 was the dominant signal, explaining 48.0% of transcriptome variance, 12.0% of 16S variance, and 3.0% of ITS variance (Fig. 5A). Factor 1 was significantly correlated with flight status (Spearman ρ=−0.76, padj=0.001; Fig. 5B), confirming that spaceflight is the primary axis of coordinated variation across omics layers.</w:t>
       </w:r>
     </w:p>
     <w:p>
@@ -2317,7 +2317,7 @@
     </w:p>
     <w:p>
       <w:r>
-        <w:t xml:space="preserve">Bipartite correlation networks identified 29 significant module-taxon relationships (BH padj &lt; 0.05), predominantly in leaf 16S (28 of 29). The flight-associated turquoise module positively correlated with </w:t>
+        <w:t xml:space="preserve">Bipartite correlation networks identified 29 significant module-taxon relationships (BH padj &lt; 0.05), predominantly in leaf 16S (28 of 29; Fig. 6). The flight-associated turquoise module positively correlated with </w:t>
       </w:r>
       <w:r>
         <w:rPr>
@@ -2425,7 +2425,7 @@
     </w:p>
     <w:p>
       <w:r>
-        <w:t xml:space="preserve">FAPROTAX assigned 239 of 348 bacterial ASVs to 29 functional categories. The dominant predicted functions were aerobic chemoheterotrophy (787,792 reads, 185 taxa), nitrogen fixation (164,614 reads, 12 taxa), methanotrophy (96,514 reads, 15 taxa), and methanol oxidation (96,687 reads, 15 taxa). The methanotrophy and methanol oxidation functions were primarily associated with </w:t>
+        <w:t xml:space="preserve">FAPROTAX assigned 239 of 348 bacterial ASVs to 29 functional categories. The dominant predicted functions were aerobic chemoheterotrophy (787,792 reads, 185 taxa), nitrogen fixation (164,614 reads, 12 taxa), methanotrophy (96,514 reads, 15 taxa), and methanol oxidation (96,687 reads, 15 taxa) (Fig. 7). The methanotrophy and methanol oxidation functions were primarily associated with </w:t>
       </w:r>
       <w:r>
         <w:rPr>

</xml_diff>

<commit_message>
Add Figure 1 study-design schematic + supplementary-table callouts (S1,S3-S10)
Co-Authored-By: Claude Opus 4.8 <noreply@anthropic.com>
</commit_message>
<xml_diff>
--- a/manuscript_with_figures.docx
+++ b/manuscript_with_figures.docx
@@ -69,7 +69,57 @@
     </w:p>
     <w:p>
       <w:r>
-        <w:t>Here we present an integrated analysis of the VEG-05 tomato microbiome (16S rRNA and ITS amplicon sequencing, OSD-766) and host transcriptome (RNA-seq, OSD-767). We characterize community health through diversity metrics and a dysbiosis index, identify co-expression modules associated with microbial changes, and infer the directionality of host-microbe interactions using a framework that distinguishes host-driven, microbe-driven, and co-regulated responses.</w:t>
+        <w:t>Here we present an integrated analysis of the VEG-05 tomato microbiome (16S rRNA and ITS amplicon sequencing, OSD-766) and host transcriptome (RNA-seq, OSD-767) (Fig. 1). We characterize community health through diversity metrics and a dysbiosis index, identify co-expression modules associated with microbial changes, and infer the directionality of host-microbe interactions using a framework that distinguishes host-driven, microbe-driven, and co-regulated responses.</w:t>
+      </w:r>
+    </w:p>
+    <w:p>
+      <w:pPr>
+        <w:jc w:val="center"/>
+      </w:pPr>
+      <w:r>
+        <w:drawing>
+          <wp:inline xmlns:a="http://schemas.openxmlformats.org/drawingml/2006/main" xmlns:pic="http://schemas.openxmlformats.org/drawingml/2006/picture">
+            <wp:extent cx="5760720" cy="2978317"/>
+            <wp:docPr id="1" name="Picture 1"/>
+            <wp:cNvGraphicFramePr>
+              <a:graphicFrameLocks noChangeAspect="1"/>
+            </wp:cNvGraphicFramePr>
+            <a:graphic>
+              <a:graphicData uri="http://schemas.openxmlformats.org/drawingml/2006/picture">
+                <pic:pic>
+                  <pic:nvPicPr>
+                    <pic:cNvPr id="0" name="fig1_study_design.png"/>
+                    <pic:cNvPicPr/>
+                  </pic:nvPicPr>
+                  <pic:blipFill>
+                    <a:blip r:embed="rId9"/>
+                    <a:stretch>
+                      <a:fillRect/>
+                    </a:stretch>
+                  </pic:blipFill>
+                  <pic:spPr>
+                    <a:xfrm>
+                      <a:off x="0" y="0"/>
+                      <a:ext cx="5760720" cy="2978317"/>
+                    </a:xfrm>
+                    <a:prstGeom prst="rect"/>
+                  </pic:spPr>
+                </pic:pic>
+              </a:graphicData>
+            </a:graphic>
+          </wp:inline>
+        </w:drawing>
+      </w:r>
+    </w:p>
+    <w:p>
+      <w:r>
+        <w:rPr>
+          <w:b/>
+        </w:rPr>
+        <w:t>*Figure 1. Study design and analysis overview.</w:t>
+      </w:r>
+      <w:r>
+        <w:t xml:space="preserve"> The ISS VEG-05 experiment (tomato cv. Red Robin; Flight vs Ground; red vs blue LED; leaf and adventitious root) feeds two data streams — host transcriptome (OSD-767) and microbiome (OSD-766) — that are combined through DESeq2, WGCNA, a dysbiosis index, MOFA+, and module–taxon networks.*</w:t>
       </w:r>
     </w:p>
     <w:p>
@@ -116,7 +166,7 @@
     </w:p>
     <w:p>
       <w:r>
-        <w:t>RNA-seq count matrices were analyzed with DESeq2 [12] separately for leaf (21 samples) and adventitious root (15 samples). The design model included flight status, light treatment, and their interaction. Log-fold changes were shrunk with apeglm [13] for main effects and ashr [14] for subset contrasts. DEGs were defined as padj &lt; 0.05 and |log2FC| ≥ 1.</w:t>
+        <w:t>RNA-seq count matrices were analyzed with DESeq2 [12] separately for leaf (21 samples) and adventitious root (15 samples; Table S1). The design model included flight status, light treatment, and their interaction. Log-fold changes were shrunk with apeglm [13] for main effects and ashr [14] for subset contrasts. DEGs were defined as padj &lt; 0.05 and |log2FC| ≥ 1.</w:t>
       </w:r>
     </w:p>
     <w:p>
@@ -220,7 +270,7 @@
     </w:p>
     <w:p>
       <w:r>
-        <w:t>Spaceflight significantly altered leaf bacterial community composition (PERMANOVA: R²=0.42, F=4.02, p=0.001, n=21) and adventitious root communities (R²=0.33, F=2.93, p=0.001, n=15). In leaves, bacterial alpha diversity was higher in flight samples: Observed ASVs ranged from 17.8–25.8 in flight versus 10.0–15.2 in ground controls (Fig. 2A). The Shannon index showed a similar pattern, with flight blue-light samples reaching 2.18 versus 0.80 in ground blue-light controls.</w:t>
+        <w:t>Spaceflight significantly altered leaf bacterial community composition (PERMANOVA: R²=0.42, F=4.02, p=0.001, n=21) and adventitious root communities (R²=0.33, F=2.93, p=0.001, n=15; Table S4). In leaves, bacterial alpha diversity was higher in flight samples: Observed ASVs ranged from 17.8–25.8 in flight versus 10.0–15.2 in ground controls (Fig. 2A; Table S3). The Shannon index showed a similar pattern, with flight blue-light samples reaching 2.18 versus 0.80 in ground blue-light controls.</w:t>
       </w:r>
     </w:p>
     <w:p>
@@ -231,7 +281,7 @@
         <w:drawing>
           <wp:inline xmlns:a="http://schemas.openxmlformats.org/drawingml/2006/main" xmlns:pic="http://schemas.openxmlformats.org/drawingml/2006/picture">
             <wp:extent cx="5760720" cy="3600450"/>
-            <wp:docPr id="1" name="Picture 1"/>
+            <wp:docPr id="2" name="Picture 2"/>
             <wp:cNvGraphicFramePr>
               <a:graphicFrameLocks noChangeAspect="1"/>
             </wp:cNvGraphicFramePr>
@@ -243,7 +293,7 @@
                     <pic:cNvPicPr/>
                   </pic:nvPicPr>
                   <pic:blipFill>
-                    <a:blip r:embed="rId9"/>
+                    <a:blip r:embed="rId10"/>
                     <a:stretch>
                       <a:fillRect/>
                     </a:stretch>
@@ -286,7 +336,7 @@
         <w:drawing>
           <wp:inline xmlns:a="http://schemas.openxmlformats.org/drawingml/2006/main" xmlns:pic="http://schemas.openxmlformats.org/drawingml/2006/picture">
             <wp:extent cx="5760720" cy="4800600"/>
-            <wp:docPr id="2" name="Picture 2"/>
+            <wp:docPr id="3" name="Picture 3"/>
             <wp:cNvGraphicFramePr>
               <a:graphicFrameLocks noChangeAspect="1"/>
             </wp:cNvGraphicFramePr>
@@ -298,7 +348,7 @@
                     <pic:cNvPicPr/>
                   </pic:nvPicPr>
                   <pic:blipFill>
-                    <a:blip r:embed="rId10"/>
+                    <a:blip r:embed="rId11"/>
                     <a:stretch>
                       <a:fillRect/>
                     </a:stretch>
@@ -336,7 +386,7 @@
         <w:drawing>
           <wp:inline xmlns:a="http://schemas.openxmlformats.org/drawingml/2006/main" xmlns:pic="http://schemas.openxmlformats.org/drawingml/2006/picture">
             <wp:extent cx="5760720" cy="4800600"/>
-            <wp:docPr id="3" name="Picture 3"/>
+            <wp:docPr id="4" name="Picture 4"/>
             <wp:cNvGraphicFramePr>
               <a:graphicFrameLocks noChangeAspect="1"/>
             </wp:cNvGraphicFramePr>
@@ -348,7 +398,7 @@
                     <pic:cNvPicPr/>
                   </pic:nvPicPr>
                   <pic:blipFill>
-                    <a:blip r:embed="rId11"/>
+                    <a:blip r:embed="rId12"/>
                     <a:stretch>
                       <a:fillRect/>
                     </a:stretch>
@@ -436,7 +486,7 @@
         <w:drawing>
           <wp:inline xmlns:a="http://schemas.openxmlformats.org/drawingml/2006/main" xmlns:pic="http://schemas.openxmlformats.org/drawingml/2006/picture">
             <wp:extent cx="5760720" cy="3456432"/>
-            <wp:docPr id="4" name="Picture 4"/>
+            <wp:docPr id="5" name="Picture 5"/>
             <wp:cNvGraphicFramePr>
               <a:graphicFrameLocks noChangeAspect="1"/>
             </wp:cNvGraphicFramePr>
@@ -448,7 +498,7 @@
                     <pic:cNvPicPr/>
                   </pic:nvPicPr>
                   <pic:blipFill>
-                    <a:blip r:embed="rId12"/>
+                    <a:blip r:embed="rId13"/>
                     <a:stretch>
                       <a:fillRect/>
                     </a:stretch>
@@ -486,7 +536,7 @@
         <w:drawing>
           <wp:inline xmlns:a="http://schemas.openxmlformats.org/drawingml/2006/main" xmlns:pic="http://schemas.openxmlformats.org/drawingml/2006/picture">
             <wp:extent cx="5760720" cy="4937760"/>
-            <wp:docPr id="5" name="Picture 5"/>
+            <wp:docPr id="6" name="Picture 6"/>
             <wp:cNvGraphicFramePr>
               <a:graphicFrameLocks noChangeAspect="1"/>
             </wp:cNvGraphicFramePr>
@@ -498,7 +548,7 @@
                     <pic:cNvPicPr/>
                   </pic:nvPicPr>
                   <pic:blipFill>
-                    <a:blip r:embed="rId13"/>
+                    <a:blip r:embed="rId14"/>
                     <a:stretch>
                       <a:fillRect/>
                     </a:stretch>
@@ -536,7 +586,7 @@
         <w:drawing>
           <wp:inline xmlns:a="http://schemas.openxmlformats.org/drawingml/2006/main" xmlns:pic="http://schemas.openxmlformats.org/drawingml/2006/picture">
             <wp:extent cx="5760720" cy="4937760"/>
-            <wp:docPr id="6" name="Picture 6"/>
+            <wp:docPr id="7" name="Picture 7"/>
             <wp:cNvGraphicFramePr>
               <a:graphicFrameLocks noChangeAspect="1"/>
             </wp:cNvGraphicFramePr>
@@ -548,7 +598,7 @@
                     <pic:cNvPicPr/>
                   </pic:nvPicPr>
                   <pic:blipFill>
-                    <a:blip r:embed="rId14"/>
+                    <a:blip r:embed="rId15"/>
                     <a:stretch>
                       <a:fillRect/>
                     </a:stretch>
@@ -588,7 +638,7 @@
     </w:p>
     <w:p>
       <w:r>
-        <w:t>WGCNA of the leaf transcriptome identified 13 modules (power=20; Fig. 4), with the turquoise module (n=2,037 genes) showing the strongest flight correlation (r=+0.73, padj=0.001) and the blue module (n=1,012) showing the strongest anti-correlation (r=−0.79, padj=3×10⁻⁴). Four leaf modules were classified as co-regulated (correlated with both flight and dysbiosis), reflecting the intertwined nature of environmental and microbial signals.</w:t>
+        <w:t>WGCNA of the leaf transcriptome identified 13 modules (power=20; Fig. 4), with the turquoise module (n=2,037 genes) showing the strongest flight correlation (r=+0.73, padj=0.001) and the blue module (n=1,012) showing the strongest anti-correlation (r=−0.79, padj=3×10⁻⁴). Four leaf modules were classified as co-regulated (correlated with both flight and dysbiosis), reflecting the intertwined nature of environmental and microbial signals (Table S5).</w:t>
       </w:r>
     </w:p>
     <w:p>
@@ -598,7 +648,7 @@
     </w:p>
     <w:p>
       <w:r>
-        <w:t>GO enrichment analysis of all modules revealed biologically coherent functional signatures. In leaves, the black module was enriched for photosynthesis and photosystem genes (p.adj=4.4×10⁻²⁵), while the red module was enriched for RNA binding and protein binding. In adventitious roots, the turquoise module (the largest, n=1,768) was enriched for oxidative stress response (peroxidase activity, p.adj=4.2×10⁻⁹; hydrogen peroxide catabolism, p.adj=1.1×10⁻⁸; glutathione transferase activity, p.adj=3.9×10⁻⁷), consistent with spaceflight-induced oxidative stress.</w:t>
+        <w:t>GO enrichment analysis of all modules revealed biologically coherent functional signatures (full results in Table S10). In leaves, the black module was enriched for photosynthesis and photosystem genes (p.adj=4.4×10⁻²⁵), while the red module was enriched for RNA binding and protein binding. In adventitious roots, the turquoise module (the largest, n=1,768) was enriched for oxidative stress response (peroxidase activity, p.adj=4.2×10⁻⁹; hydrogen peroxide catabolism, p.adj=1.1×10⁻⁸; glutathione transferase activity, p.adj=3.9×10⁻⁷), consistent with spaceflight-induced oxidative stress.</w:t>
       </w:r>
     </w:p>
     <w:p>
@@ -609,7 +659,7 @@
         <w:drawing>
           <wp:inline xmlns:a="http://schemas.openxmlformats.org/drawingml/2006/main" xmlns:pic="http://schemas.openxmlformats.org/drawingml/2006/picture">
             <wp:extent cx="5760720" cy="6887567"/>
-            <wp:docPr id="7" name="Picture 7"/>
+            <wp:docPr id="8" name="Picture 8"/>
             <wp:cNvGraphicFramePr>
               <a:graphicFrameLocks noChangeAspect="1"/>
             </wp:cNvGraphicFramePr>
@@ -621,7 +671,7 @@
                     <pic:cNvPicPr/>
                   </pic:nvPicPr>
                   <pic:blipFill>
-                    <a:blip r:embed="rId15"/>
+                    <a:blip r:embed="rId16"/>
                     <a:stretch>
                       <a:fillRect/>
                     </a:stretch>
@@ -659,7 +709,7 @@
         <w:drawing>
           <wp:inline xmlns:a="http://schemas.openxmlformats.org/drawingml/2006/main" xmlns:pic="http://schemas.openxmlformats.org/drawingml/2006/picture">
             <wp:extent cx="5010317" cy="7498079"/>
-            <wp:docPr id="8" name="Picture 8"/>
+            <wp:docPr id="9" name="Picture 9"/>
             <wp:cNvGraphicFramePr>
               <a:graphicFrameLocks noChangeAspect="1"/>
             </wp:cNvGraphicFramePr>
@@ -671,7 +721,7 @@
                     <pic:cNvPicPr/>
                   </pic:nvPicPr>
                   <pic:blipFill>
-                    <a:blip r:embed="rId16"/>
+                    <a:blip r:embed="rId17"/>
                     <a:stretch>
                       <a:fillRect/>
                     </a:stretch>
@@ -2204,107 +2254,7 @@
     </w:p>
     <w:p>
       <w:r>
-        <w:t>Factor 2 showed a trend toward correlation with 16S dysbiosis (ρ=−0.52, p=0.018, padj=0.089), while Factor 3 trended with both light treatment (ρ=0.52) and ITS dysbiosis (ρ=0.50). The transcriptome contributed the highest-weighted features to all factors, reflecting its greater dimensionality, but microbial features were consistently present in the top weights.</w:t>
-      </w:r>
-    </w:p>
-    <w:p>
-      <w:pPr>
-        <w:jc w:val="center"/>
-      </w:pPr>
-      <w:r>
-        <w:drawing>
-          <wp:inline xmlns:a="http://schemas.openxmlformats.org/drawingml/2006/main" xmlns:pic="http://schemas.openxmlformats.org/drawingml/2006/picture">
-            <wp:extent cx="5760720" cy="3600450"/>
-            <wp:docPr id="9" name="Picture 9"/>
-            <wp:cNvGraphicFramePr>
-              <a:graphicFrameLocks noChangeAspect="1"/>
-            </wp:cNvGraphicFramePr>
-            <a:graphic>
-              <a:graphicData uri="http://schemas.openxmlformats.org/drawingml/2006/picture">
-                <pic:pic>
-                  <pic:nvPicPr>
-                    <pic:cNvPr id="0" name="fig5a_mofa_variance.png"/>
-                    <pic:cNvPicPr/>
-                  </pic:nvPicPr>
-                  <pic:blipFill>
-                    <a:blip r:embed="rId17"/>
-                    <a:stretch>
-                      <a:fillRect/>
-                    </a:stretch>
-                  </pic:blipFill>
-                  <pic:spPr>
-                    <a:xfrm>
-                      <a:off x="0" y="0"/>
-                      <a:ext cx="5760720" cy="3600450"/>
-                    </a:xfrm>
-                    <a:prstGeom prst="rect"/>
-                  </pic:spPr>
-                </pic:pic>
-              </a:graphicData>
-            </a:graphic>
-          </wp:inline>
-        </w:drawing>
-      </w:r>
-    </w:p>
-    <w:p>
-      <w:r>
-        <w:rPr>
-          <w:b/>
-        </w:rPr>
-        <w:t>*Figure 5A.</w:t>
-      </w:r>
-      <w:r>
-        <w:t xml:space="preserve"> MOFA+ variance explained per factor per view (transcriptome, 16S, ITS).*</w:t>
-      </w:r>
-    </w:p>
-    <w:p>
-      <w:pPr>
-        <w:jc w:val="center"/>
-      </w:pPr>
-      <w:r>
-        <w:drawing>
-          <wp:inline xmlns:a="http://schemas.openxmlformats.org/drawingml/2006/main" xmlns:pic="http://schemas.openxmlformats.org/drawingml/2006/picture">
-            <wp:extent cx="5760720" cy="4114800"/>
-            <wp:docPr id="10" name="Picture 10"/>
-            <wp:cNvGraphicFramePr>
-              <a:graphicFrameLocks noChangeAspect="1"/>
-            </wp:cNvGraphicFramePr>
-            <a:graphic>
-              <a:graphicData uri="http://schemas.openxmlformats.org/drawingml/2006/picture">
-                <pic:pic>
-                  <pic:nvPicPr>
-                    <pic:cNvPr id="0" name="fig5b_mofa_correlations.png"/>
-                    <pic:cNvPicPr/>
-                  </pic:nvPicPr>
-                  <pic:blipFill>
-                    <a:blip r:embed="rId18"/>
-                    <a:stretch>
-                      <a:fillRect/>
-                    </a:stretch>
-                  </pic:blipFill>
-                  <pic:spPr>
-                    <a:xfrm>
-                      <a:off x="0" y="0"/>
-                      <a:ext cx="5760720" cy="4114800"/>
-                    </a:xfrm>
-                    <a:prstGeom prst="rect"/>
-                  </pic:spPr>
-                </pic:pic>
-              </a:graphicData>
-            </a:graphic>
-          </wp:inline>
-        </w:drawing>
-      </w:r>
-    </w:p>
-    <w:p>
-      <w:r>
-        <w:rPr>
-          <w:b/>
-        </w:rPr>
-        <w:t>*Figure 5B.</w:t>
-      </w:r>
-      <w:r>
-        <w:t xml:space="preserve"> MOFA+ factor–trait correlations; Factor 1 captures flight (ρ=−0.76).*</w:t>
+        <w:t>Factor 2 showed a trend toward correlation with 16S dysbiosis (ρ=−0.52, p=0.018, padj=0.089), while Factor 3 trended with both light treatment (ρ=0.52) and ITS dysbiosis (ρ=0.50). The transcriptome contributed the highest-weighted features to all factors, reflecting its greater dimensionality, but microbial features were consistently present in the top weights (Table S8).</w:t>
       </w:r>
     </w:p>
     <w:p>
@@ -2317,7 +2267,7 @@
     </w:p>
     <w:p>
       <w:r>
-        <w:t xml:space="preserve">Bipartite correlation networks identified 29 significant module-taxon relationships (BH padj &lt; 0.05), predominantly in leaf 16S (28 of 29; Fig. 6). The flight-associated turquoise module positively correlated with </w:t>
+        <w:t xml:space="preserve">Bipartite correlation networks identified 29 significant module-taxon relationships (BH padj &lt; 0.05), predominantly in leaf 16S (28 of 29; Fig. 6; Table S9). The flight-associated turquoise module positively correlated with </w:t>
       </w:r>
       <w:r>
         <w:rPr>
@@ -2373,7 +2323,7 @@
         <w:drawing>
           <wp:inline xmlns:a="http://schemas.openxmlformats.org/drawingml/2006/main" xmlns:pic="http://schemas.openxmlformats.org/drawingml/2006/picture">
             <wp:extent cx="5760720" cy="4531368"/>
-            <wp:docPr id="11" name="Picture 11"/>
+            <wp:docPr id="10" name="Picture 10"/>
             <wp:cNvGraphicFramePr>
               <a:graphicFrameLocks noChangeAspect="1"/>
             </wp:cNvGraphicFramePr>
@@ -2385,7 +2335,7 @@
                     <pic:cNvPicPr/>
                   </pic:nvPicPr>
                   <pic:blipFill>
-                    <a:blip r:embed="rId19"/>
+                    <a:blip r:embed="rId18"/>
                     <a:stretch>
                       <a:fillRect/>
                     </a:stretch>
@@ -2425,7 +2375,7 @@
     </w:p>
     <w:p>
       <w:r>
-        <w:t xml:space="preserve">FAPROTAX assigned 239 of 348 bacterial ASVs to 29 functional categories. The dominant predicted functions were aerobic chemoheterotrophy (787,792 reads, 185 taxa), nitrogen fixation (164,614 reads, 12 taxa), methanotrophy (96,514 reads, 15 taxa), and methanol oxidation (96,687 reads, 15 taxa) (Fig. 7). The methanotrophy and methanol oxidation functions were primarily associated with </w:t>
+        <w:t xml:space="preserve">FAPROTAX assigned 239 of 348 bacterial ASVs to 29 functional categories (Table S6). The dominant predicted functions were aerobic chemoheterotrophy (787,792 reads, 185 taxa), nitrogen fixation (164,614 reads, 12 taxa), methanotrophy (96,514 reads, 15 taxa), and methanol oxidation (96,687 reads, 15 taxa) (Fig. 7). The methanotrophy and methanol oxidation functions were primarily associated with </w:t>
       </w:r>
       <w:r>
         <w:rPr>
@@ -2466,57 +2416,7 @@
         <w:t>Fusarium</w:t>
       </w:r>
       <w:r>
-        <w:t xml:space="preserve"> spp.) as the main ecological guilds.</w:t>
-      </w:r>
-    </w:p>
-    <w:p>
-      <w:pPr>
-        <w:jc w:val="center"/>
-      </w:pPr>
-      <w:r>
-        <w:drawing>
-          <wp:inline xmlns:a="http://schemas.openxmlformats.org/drawingml/2006/main" xmlns:pic="http://schemas.openxmlformats.org/drawingml/2006/picture">
-            <wp:extent cx="5760720" cy="4320540"/>
-            <wp:docPr id="12" name="Picture 12"/>
-            <wp:cNvGraphicFramePr>
-              <a:graphicFrameLocks noChangeAspect="1"/>
-            </wp:cNvGraphicFramePr>
-            <a:graphic>
-              <a:graphicData uri="http://schemas.openxmlformats.org/drawingml/2006/picture">
-                <pic:pic>
-                  <pic:nvPicPr>
-                    <pic:cNvPr id="0" name="fig7_faprotax.png"/>
-                    <pic:cNvPicPr/>
-                  </pic:nvPicPr>
-                  <pic:blipFill>
-                    <a:blip r:embed="rId20"/>
-                    <a:stretch>
-                      <a:fillRect/>
-                    </a:stretch>
-                  </pic:blipFill>
-                  <pic:spPr>
-                    <a:xfrm>
-                      <a:off x="0" y="0"/>
-                      <a:ext cx="5760720" cy="4320540"/>
-                    </a:xfrm>
-                    <a:prstGeom prst="rect"/>
-                  </pic:spPr>
-                </pic:pic>
-              </a:graphicData>
-            </a:graphic>
-          </wp:inline>
-        </w:drawing>
-      </w:r>
-    </w:p>
-    <w:p>
-      <w:r>
-        <w:rPr>
-          <w:b/>
-        </w:rPr>
-        <w:t>*Figure 7.</w:t>
-      </w:r>
-      <w:r>
-        <w:t xml:space="preserve"> FAPROTAX predicted bacterial functions (aerobic chemoheterotrophy, N fixation, methanotrophy, methanol oxidation).*</w:t>
+        <w:t xml:space="preserve"> spp.) as the main ecological guilds (Table S7).</w:t>
       </w:r>
     </w:p>
     <w:p>
@@ -2624,6 +2524,20 @@
       </w:pPr>
       <w:r>
         <w:t>Figure legends</w:t>
+      </w:r>
+    </w:p>
+    <w:p>
+      <w:pPr>
+        <w:pStyle w:val="ListBullet"/>
+      </w:pPr>
+      <w:r>
+        <w:rPr>
+          <w:b/>
+        </w:rPr>
+        <w:t>Figure 1. Study design and analysis overview.</w:t>
+      </w:r>
+      <w:r>
+        <w:t xml:space="preserve"> The ISS VEG-05 experiment (tomato cv. Red Robin; Flight vs Ground; red vs blue LED; leaf and adventitious root) feeds two data streams — host transcriptome (OSD-767) and microbiome (OSD-766) — that are combined through DESeq2, WGCNA, a dysbiosis index, MOFA+, and module–taxon networks.</w:t>
       </w:r>
     </w:p>
     <w:p>

</xml_diff>

<commit_message>
Fix two figure anchors broken by table callouts (Fig 5/7 now embed; docx = 13 figs)
Co-Authored-By: Claude Opus 4.8 <noreply@anthropic.com>
</commit_message>
<xml_diff>
--- a/manuscript_with_figures.docx
+++ b/manuscript_with_figures.docx
@@ -2259,6 +2259,106 @@
     </w:p>
     <w:p>
       <w:pPr>
+        <w:jc w:val="center"/>
+      </w:pPr>
+      <w:r>
+        <w:drawing>
+          <wp:inline xmlns:a="http://schemas.openxmlformats.org/drawingml/2006/main" xmlns:pic="http://schemas.openxmlformats.org/drawingml/2006/picture">
+            <wp:extent cx="5760720" cy="3600450"/>
+            <wp:docPr id="10" name="Picture 10"/>
+            <wp:cNvGraphicFramePr>
+              <a:graphicFrameLocks noChangeAspect="1"/>
+            </wp:cNvGraphicFramePr>
+            <a:graphic>
+              <a:graphicData uri="http://schemas.openxmlformats.org/drawingml/2006/picture">
+                <pic:pic>
+                  <pic:nvPicPr>
+                    <pic:cNvPr id="0" name="fig5a_mofa_variance.png"/>
+                    <pic:cNvPicPr/>
+                  </pic:nvPicPr>
+                  <pic:blipFill>
+                    <a:blip r:embed="rId18"/>
+                    <a:stretch>
+                      <a:fillRect/>
+                    </a:stretch>
+                  </pic:blipFill>
+                  <pic:spPr>
+                    <a:xfrm>
+                      <a:off x="0" y="0"/>
+                      <a:ext cx="5760720" cy="3600450"/>
+                    </a:xfrm>
+                    <a:prstGeom prst="rect"/>
+                  </pic:spPr>
+                </pic:pic>
+              </a:graphicData>
+            </a:graphic>
+          </wp:inline>
+        </w:drawing>
+      </w:r>
+    </w:p>
+    <w:p>
+      <w:r>
+        <w:rPr>
+          <w:b/>
+        </w:rPr>
+        <w:t>*Figure 5A.</w:t>
+      </w:r>
+      <w:r>
+        <w:t xml:space="preserve"> MOFA+ variance explained per factor per view (transcriptome, 16S, ITS).*</w:t>
+      </w:r>
+    </w:p>
+    <w:p>
+      <w:pPr>
+        <w:jc w:val="center"/>
+      </w:pPr>
+      <w:r>
+        <w:drawing>
+          <wp:inline xmlns:a="http://schemas.openxmlformats.org/drawingml/2006/main" xmlns:pic="http://schemas.openxmlformats.org/drawingml/2006/picture">
+            <wp:extent cx="5760720" cy="4114800"/>
+            <wp:docPr id="11" name="Picture 11"/>
+            <wp:cNvGraphicFramePr>
+              <a:graphicFrameLocks noChangeAspect="1"/>
+            </wp:cNvGraphicFramePr>
+            <a:graphic>
+              <a:graphicData uri="http://schemas.openxmlformats.org/drawingml/2006/picture">
+                <pic:pic>
+                  <pic:nvPicPr>
+                    <pic:cNvPr id="0" name="fig5b_mofa_correlations.png"/>
+                    <pic:cNvPicPr/>
+                  </pic:nvPicPr>
+                  <pic:blipFill>
+                    <a:blip r:embed="rId19"/>
+                    <a:stretch>
+                      <a:fillRect/>
+                    </a:stretch>
+                  </pic:blipFill>
+                  <pic:spPr>
+                    <a:xfrm>
+                      <a:off x="0" y="0"/>
+                      <a:ext cx="5760720" cy="4114800"/>
+                    </a:xfrm>
+                    <a:prstGeom prst="rect"/>
+                  </pic:spPr>
+                </pic:pic>
+              </a:graphicData>
+            </a:graphic>
+          </wp:inline>
+        </w:drawing>
+      </w:r>
+    </w:p>
+    <w:p>
+      <w:r>
+        <w:rPr>
+          <w:b/>
+        </w:rPr>
+        <w:t>*Figure 5B.</w:t>
+      </w:r>
+      <w:r>
+        <w:t xml:space="preserve"> MOFA+ factor–trait correlations; Factor 1 captures flight (ρ=−0.76).*</w:t>
+      </w:r>
+    </w:p>
+    <w:p>
+      <w:pPr>
         <w:pStyle w:val="Heading2"/>
       </w:pPr>
       <w:r>
@@ -2323,7 +2423,7 @@
         <w:drawing>
           <wp:inline xmlns:a="http://schemas.openxmlformats.org/drawingml/2006/main" xmlns:pic="http://schemas.openxmlformats.org/drawingml/2006/picture">
             <wp:extent cx="5760720" cy="4531368"/>
-            <wp:docPr id="10" name="Picture 10"/>
+            <wp:docPr id="12" name="Picture 12"/>
             <wp:cNvGraphicFramePr>
               <a:graphicFrameLocks noChangeAspect="1"/>
             </wp:cNvGraphicFramePr>
@@ -2335,7 +2435,7 @@
                     <pic:cNvPicPr/>
                   </pic:nvPicPr>
                   <pic:blipFill>
-                    <a:blip r:embed="rId18"/>
+                    <a:blip r:embed="rId20"/>
                     <a:stretch>
                       <a:fillRect/>
                     </a:stretch>
@@ -2417,6 +2517,56 @@
       </w:r>
       <w:r>
         <w:t xml:space="preserve"> spp.) as the main ecological guilds (Table S7).</w:t>
+      </w:r>
+    </w:p>
+    <w:p>
+      <w:pPr>
+        <w:jc w:val="center"/>
+      </w:pPr>
+      <w:r>
+        <w:drawing>
+          <wp:inline xmlns:a="http://schemas.openxmlformats.org/drawingml/2006/main" xmlns:pic="http://schemas.openxmlformats.org/drawingml/2006/picture">
+            <wp:extent cx="5760720" cy="4320540"/>
+            <wp:docPr id="13" name="Picture 13"/>
+            <wp:cNvGraphicFramePr>
+              <a:graphicFrameLocks noChangeAspect="1"/>
+            </wp:cNvGraphicFramePr>
+            <a:graphic>
+              <a:graphicData uri="http://schemas.openxmlformats.org/drawingml/2006/picture">
+                <pic:pic>
+                  <pic:nvPicPr>
+                    <pic:cNvPr id="0" name="fig7_faprotax.png"/>
+                    <pic:cNvPicPr/>
+                  </pic:nvPicPr>
+                  <pic:blipFill>
+                    <a:blip r:embed="rId21"/>
+                    <a:stretch>
+                      <a:fillRect/>
+                    </a:stretch>
+                  </pic:blipFill>
+                  <pic:spPr>
+                    <a:xfrm>
+                      <a:off x="0" y="0"/>
+                      <a:ext cx="5760720" cy="4320540"/>
+                    </a:xfrm>
+                    <a:prstGeom prst="rect"/>
+                  </pic:spPr>
+                </pic:pic>
+              </a:graphicData>
+            </a:graphic>
+          </wp:inline>
+        </w:drawing>
+      </w:r>
+    </w:p>
+    <w:p>
+      <w:r>
+        <w:rPr>
+          <w:b/>
+        </w:rPr>
+        <w:t>*Figure 7.</w:t>
+      </w:r>
+      <w:r>
+        <w:t xml:space="preserve"> FAPROTAX predicted bacterial functions (aerobic chemoheterotrophy, N fixation, methanotrophy, methanol oxidation).*</w:t>
       </w:r>
     </w:p>
     <w:p>

</xml_diff>